<commit_message>
Expand lab 2 conclusions with comparison and limitations
</commit_message>
<xml_diff>
--- a/lab2/Отчёт_Лабораторная_2.docx
+++ b/lab2/Отчёт_Лабораторная_2.docx
@@ -543,12 +543,16 @@
     <w:p>
       <w:pPr>
         <w:pStyle w:val="Heading1"/>
+        <w:spacing w:line="252" w:lineRule="auto" w:after="100" w:before="240"/>
       </w:pPr>
       <w:r>
         <w:t>6 Проверка корректности</w:t>
       </w:r>
     </w:p>
     <w:p>
+      <w:pPr>
+        <w:spacing w:line="252" w:lineRule="auto" w:after="100"/>
+      </w:pPr>
       <w:r>
         <w:rPr>
           <w:b w:val="0"/>
@@ -573,7 +577,7 @@
           </w:tcPr>
           <w:p>
             <w:pPr>
-              <w:spacing w:after="60" w:before="60"/>
+              <w:spacing w:after="40" w:before="40"/>
             </w:pPr>
             <w:r>
               <w:rPr>
@@ -590,7 +594,7 @@
           </w:tcPr>
           <w:p>
             <w:pPr>
-              <w:spacing w:after="60" w:before="60"/>
+              <w:spacing w:after="40" w:before="40"/>
             </w:pPr>
             <w:r>
               <w:rPr>
@@ -609,7 +613,7 @@
           </w:tcPr>
           <w:p>
             <w:pPr>
-              <w:spacing w:after="60" w:before="60"/>
+              <w:spacing w:after="40" w:before="40"/>
             </w:pPr>
             <w:r>
               <w:rPr>
@@ -625,7 +629,7 @@
           </w:tcPr>
           <w:p>
             <w:pPr>
-              <w:spacing w:after="60" w:before="60"/>
+              <w:spacing w:after="40" w:before="40"/>
             </w:pPr>
             <w:r>
               <w:rPr>
@@ -643,7 +647,7 @@
           </w:tcPr>
           <w:p>
             <w:pPr>
-              <w:spacing w:after="60" w:before="60"/>
+              <w:spacing w:after="40" w:before="40"/>
             </w:pPr>
             <w:r>
               <w:rPr>
@@ -659,7 +663,7 @@
           </w:tcPr>
           <w:p>
             <w:pPr>
-              <w:spacing w:after="60" w:before="60"/>
+              <w:spacing w:after="40" w:before="40"/>
             </w:pPr>
             <w:r>
               <w:rPr>
@@ -677,7 +681,7 @@
           </w:tcPr>
           <w:p>
             <w:pPr>
-              <w:spacing w:after="60" w:before="60"/>
+              <w:spacing w:after="40" w:before="40"/>
             </w:pPr>
             <w:r>
               <w:rPr>
@@ -693,7 +697,7 @@
           </w:tcPr>
           <w:p>
             <w:pPr>
-              <w:spacing w:after="60" w:before="60"/>
+              <w:spacing w:after="40" w:before="40"/>
             </w:pPr>
             <w:r>
               <w:rPr>
@@ -711,7 +715,7 @@
           </w:tcPr>
           <w:p>
             <w:pPr>
-              <w:spacing w:after="60" w:before="60"/>
+              <w:spacing w:after="40" w:before="40"/>
             </w:pPr>
             <w:r>
               <w:rPr>
@@ -727,7 +731,7 @@
           </w:tcPr>
           <w:p>
             <w:pPr>
-              <w:spacing w:after="60" w:before="60"/>
+              <w:spacing w:after="40" w:before="40"/>
             </w:pPr>
             <w:r>
               <w:rPr>
@@ -745,7 +749,7 @@
           </w:tcPr>
           <w:p>
             <w:pPr>
-              <w:spacing w:after="60" w:before="60"/>
+              <w:spacing w:after="40" w:before="40"/>
             </w:pPr>
             <w:r>
               <w:rPr>
@@ -761,7 +765,7 @@
           </w:tcPr>
           <w:p>
             <w:pPr>
-              <w:spacing w:after="60" w:before="60"/>
+              <w:spacing w:after="40" w:before="40"/>
             </w:pPr>
             <w:r>
               <w:rPr>
@@ -779,7 +783,7 @@
           </w:tcPr>
           <w:p>
             <w:pPr>
-              <w:spacing w:after="60" w:before="60"/>
+              <w:spacing w:after="40" w:before="40"/>
             </w:pPr>
             <w:r>
               <w:rPr>
@@ -795,7 +799,7 @@
           </w:tcPr>
           <w:p>
             <w:pPr>
-              <w:spacing w:after="60" w:before="60"/>
+              <w:spacing w:after="40" w:before="40"/>
             </w:pPr>
             <w:r>
               <w:rPr>
@@ -808,6 +812,9 @@
       </w:tr>
     </w:tbl>
     <w:p>
+      <w:pPr>
+        <w:spacing w:line="252" w:lineRule="auto" w:after="100"/>
+      </w:pPr>
       <w:r>
         <w:rPr>
           <w:b w:val="0"/>
@@ -835,7 +842,7 @@
           </w:tcPr>
           <w:p>
             <w:pPr>
-              <w:spacing w:after="60" w:before="60"/>
+              <w:spacing w:after="40" w:before="40"/>
             </w:pPr>
             <w:r>
               <w:rPr>
@@ -852,7 +859,7 @@
           </w:tcPr>
           <w:p>
             <w:pPr>
-              <w:spacing w:after="60" w:before="60"/>
+              <w:spacing w:after="40" w:before="40"/>
             </w:pPr>
             <w:r>
               <w:rPr>
@@ -869,7 +876,7 @@
           </w:tcPr>
           <w:p>
             <w:pPr>
-              <w:spacing w:after="60" w:before="60"/>
+              <w:spacing w:after="40" w:before="40"/>
             </w:pPr>
             <w:r>
               <w:rPr>
@@ -886,7 +893,7 @@
           </w:tcPr>
           <w:p>
             <w:pPr>
-              <w:spacing w:after="60" w:before="60"/>
+              <w:spacing w:after="40" w:before="40"/>
             </w:pPr>
             <w:r>
               <w:rPr>
@@ -903,7 +910,7 @@
           </w:tcPr>
           <w:p>
             <w:pPr>
-              <w:spacing w:after="60" w:before="60"/>
+              <w:spacing w:after="40" w:before="40"/>
             </w:pPr>
             <w:r>
               <w:rPr>
@@ -922,7 +929,7 @@
           </w:tcPr>
           <w:p>
             <w:pPr>
-              <w:spacing w:after="60" w:before="60"/>
+              <w:spacing w:after="40" w:before="40"/>
             </w:pPr>
             <w:r>
               <w:rPr>
@@ -938,7 +945,7 @@
           </w:tcPr>
           <w:p>
             <w:pPr>
-              <w:spacing w:after="60" w:before="60"/>
+              <w:spacing w:after="40" w:before="40"/>
             </w:pPr>
             <w:r>
               <w:rPr>
@@ -954,7 +961,7 @@
           </w:tcPr>
           <w:p>
             <w:pPr>
-              <w:spacing w:after="60" w:before="60"/>
+              <w:spacing w:after="40" w:before="40"/>
             </w:pPr>
             <w:r>
               <w:rPr>
@@ -970,7 +977,7 @@
           </w:tcPr>
           <w:p>
             <w:pPr>
-              <w:spacing w:after="60" w:before="60"/>
+              <w:spacing w:after="40" w:before="40"/>
             </w:pPr>
             <w:r>
               <w:rPr>
@@ -986,7 +993,7 @@
           </w:tcPr>
           <w:p>
             <w:pPr>
-              <w:spacing w:after="60" w:before="60"/>
+              <w:spacing w:after="40" w:before="40"/>
             </w:pPr>
             <w:r>
               <w:rPr>
@@ -1004,7 +1011,7 @@
           </w:tcPr>
           <w:p>
             <w:pPr>
-              <w:spacing w:after="60" w:before="60"/>
+              <w:spacing w:after="40" w:before="40"/>
             </w:pPr>
             <w:r>
               <w:rPr>
@@ -1020,7 +1027,7 @@
           </w:tcPr>
           <w:p>
             <w:pPr>
-              <w:spacing w:after="60" w:before="60"/>
+              <w:spacing w:after="40" w:before="40"/>
             </w:pPr>
             <w:r>
               <w:rPr>
@@ -1036,7 +1043,7 @@
           </w:tcPr>
           <w:p>
             <w:pPr>
-              <w:spacing w:after="60" w:before="60"/>
+              <w:spacing w:after="40" w:before="40"/>
             </w:pPr>
             <w:r>
               <w:rPr>
@@ -1052,7 +1059,7 @@
           </w:tcPr>
           <w:p>
             <w:pPr>
-              <w:spacing w:after="60" w:before="60"/>
+              <w:spacing w:after="40" w:before="40"/>
             </w:pPr>
             <w:r>
               <w:rPr>
@@ -1068,7 +1075,7 @@
           </w:tcPr>
           <w:p>
             <w:pPr>
-              <w:spacing w:after="60" w:before="60"/>
+              <w:spacing w:after="40" w:before="40"/>
             </w:pPr>
             <w:r>
               <w:rPr>
@@ -1086,7 +1093,7 @@
           </w:tcPr>
           <w:p>
             <w:pPr>
-              <w:spacing w:after="60" w:before="60"/>
+              <w:spacing w:after="40" w:before="40"/>
             </w:pPr>
             <w:r>
               <w:rPr>
@@ -1102,7 +1109,7 @@
           </w:tcPr>
           <w:p>
             <w:pPr>
-              <w:spacing w:after="60" w:before="60"/>
+              <w:spacing w:after="40" w:before="40"/>
             </w:pPr>
             <w:r>
               <w:rPr>
@@ -1118,7 +1125,7 @@
           </w:tcPr>
           <w:p>
             <w:pPr>
-              <w:spacing w:after="60" w:before="60"/>
+              <w:spacing w:after="40" w:before="40"/>
             </w:pPr>
             <w:r>
               <w:rPr>
@@ -1134,7 +1141,7 @@
           </w:tcPr>
           <w:p>
             <w:pPr>
-              <w:spacing w:after="60" w:before="60"/>
+              <w:spacing w:after="40" w:before="40"/>
             </w:pPr>
             <w:r>
               <w:rPr>
@@ -1150,7 +1157,7 @@
           </w:tcPr>
           <w:p>
             <w:pPr>
-              <w:spacing w:after="60" w:before="60"/>
+              <w:spacing w:after="40" w:before="40"/>
             </w:pPr>
             <w:r>
               <w:rPr>
@@ -1168,7 +1175,7 @@
           </w:tcPr>
           <w:p>
             <w:pPr>
-              <w:spacing w:after="60" w:before="60"/>
+              <w:spacing w:after="40" w:before="40"/>
             </w:pPr>
             <w:r>
               <w:rPr>
@@ -1184,7 +1191,7 @@
           </w:tcPr>
           <w:p>
             <w:pPr>
-              <w:spacing w:after="60" w:before="60"/>
+              <w:spacing w:after="40" w:before="40"/>
             </w:pPr>
             <w:r>
               <w:rPr>
@@ -1200,7 +1207,7 @@
           </w:tcPr>
           <w:p>
             <w:pPr>
-              <w:spacing w:after="60" w:before="60"/>
+              <w:spacing w:after="40" w:before="40"/>
             </w:pPr>
             <w:r>
               <w:rPr>
@@ -1216,7 +1223,7 @@
           </w:tcPr>
           <w:p>
             <w:pPr>
-              <w:spacing w:after="60" w:before="60"/>
+              <w:spacing w:after="40" w:before="40"/>
             </w:pPr>
             <w:r>
               <w:rPr>
@@ -1232,7 +1239,7 @@
           </w:tcPr>
           <w:p>
             <w:pPr>
-              <w:spacing w:after="60" w:before="60"/>
+              <w:spacing w:after="40" w:before="40"/>
             </w:pPr>
             <w:r>
               <w:rPr>
@@ -1250,7 +1257,7 @@
           </w:tcPr>
           <w:p>
             <w:pPr>
-              <w:spacing w:after="60" w:before="60"/>
+              <w:spacing w:after="40" w:before="40"/>
             </w:pPr>
             <w:r>
               <w:rPr>
@@ -1266,7 +1273,7 @@
           </w:tcPr>
           <w:p>
             <w:pPr>
-              <w:spacing w:after="60" w:before="60"/>
+              <w:spacing w:after="40" w:before="40"/>
             </w:pPr>
             <w:r>
               <w:rPr>
@@ -1282,7 +1289,7 @@
           </w:tcPr>
           <w:p>
             <w:pPr>
-              <w:spacing w:after="60" w:before="60"/>
+              <w:spacing w:after="40" w:before="40"/>
             </w:pPr>
             <w:r>
               <w:rPr>
@@ -1298,7 +1305,7 @@
           </w:tcPr>
           <w:p>
             <w:pPr>
-              <w:spacing w:after="60" w:before="60"/>
+              <w:spacing w:after="40" w:before="40"/>
             </w:pPr>
             <w:r>
               <w:rPr>
@@ -1314,7 +1321,7 @@
           </w:tcPr>
           <w:p>
             <w:pPr>
-              <w:spacing w:after="60" w:before="60"/>
+              <w:spacing w:after="40" w:before="40"/>
             </w:pPr>
             <w:r>
               <w:rPr>
@@ -1327,6 +1334,9 @@
       </w:tr>
     </w:tbl>
     <w:p>
+      <w:pPr>
+        <w:spacing w:line="252" w:lineRule="auto" w:after="100"/>
+      </w:pPr>
       <w:r>
         <w:rPr>
           <w:b w:val="0"/>
@@ -1337,12 +1347,16 @@
     <w:p>
       <w:pPr>
         <w:pStyle w:val="Heading1"/>
+        <w:spacing w:line="252" w:lineRule="auto" w:after="100" w:before="240"/>
       </w:pPr>
       <w:r>
         <w:t>7 Результаты</w:t>
       </w:r>
     </w:p>
     <w:p>
+      <w:pPr>
+        <w:spacing w:line="252" w:lineRule="auto" w:after="100"/>
+      </w:pPr>
       <w:r>
         <w:rPr>
           <w:b w:val="0"/>
@@ -1353,17 +1367,43 @@
     <w:p>
       <w:pPr>
         <w:pStyle w:val="Heading1"/>
+        <w:spacing w:line="252" w:lineRule="auto" w:after="100" w:before="240"/>
       </w:pPr>
       <w:r>
         <w:t>8 Выводы</w:t>
       </w:r>
     </w:p>
     <w:p>
+      <w:pPr>
+        <w:spacing w:line="252" w:lineRule="auto" w:after="100"/>
+      </w:pPr>
       <w:r>
         <w:rPr>
           <w:b w:val="0"/>
         </w:rPr>
-        <w:t>Линейное контрастирование эффективно расширяет узкий диапазон, но чувствительно к крайним пикселям. Эквализация учитывает частоты уровней и лучше выделяет детали в неравномерно распределённых тенях. Независимая обработка RGB может изменить оттенки; обработка V лучше сохраняет цветовые отношения. Выбор метода зависит от изображения: усиление контраста способно также усилить шум, поэтому результат следует оценивать визуально вместе с гистограммой.</w:t>
+        <w:t>Линейное контрастирование эффективно расширяет узкий диапазон яркости, но чувствительно к крайним пикселям. На тёмной тестовой сцене диапазон уже составлял 0–255, поэтому растяжение не дало изменений. Эквализация учитывает частоты уровней и в этом случае повысила различимость деталей в тенях.</w:t>
+      </w:r>
+    </w:p>
+    <w:p>
+      <w:pPr>
+        <w:spacing w:line="252" w:lineRule="auto" w:after="100"/>
+      </w:pPr>
+      <w:r>
+        <w:rPr>
+          <w:b w:val="0"/>
+        </w:rPr>
+        <w:t>Независимая эквализация RGB меняет соотношения каналов и может искажать оттенки. Обработка только V в HSV лучше сохраняет цветовые отношения: тон и насыщенность остаются прежними до округления. Однотонные изображения требуют отдельной обработки, исключающей деление на ноль.</w:t>
+      </w:r>
+    </w:p>
+    <w:p>
+      <w:pPr>
+        <w:spacing w:line="252" w:lineRule="auto" w:after="100"/>
+      </w:pPr>
+      <w:r>
+        <w:rPr>
+          <w:b w:val="0"/>
+        </w:rPr>
+        <w:t>Выбор метода зависит от исходного изображения: усиление контраста может подчеркнуть шум и сделать переходы резкими. Поэтому результат следует оценивать визуально вместе с гистограммой. Рост разброса яркости или энтропии не гарантирует улучшения качества, а автоматические тесты подтверждают именно корректность вычислений.</w:t>
       </w:r>
     </w:p>
     <w:sectPr>

</xml_diff>

<commit_message>
Expand lab 2 to ten samples showing benefits and limitations
</commit_message>
<xml_diff>
--- a/lab2/Отчёт_Лабораторная_2.docx
+++ b/lab2/Отчёт_Лабораторная_2.docx
@@ -282,7 +282,7 @@
       <w:r>
         <w:drawing>
           <wp:inline xmlns:a="http://schemas.openxmlformats.org/drawingml/2006/main" xmlns:pic="http://schemas.openxmlformats.org/drawingml/2006/picture">
-            <wp:extent cx="4754880" cy="4617618"/>
+            <wp:extent cx="4754880" cy="3341643"/>
             <wp:docPr id="1" name="Picture 1"/>
             <wp:cNvGraphicFramePr>
               <a:graphicFrameLocks noChangeAspect="1"/>
@@ -303,7 +303,7 @@
                   <pic:spPr>
                     <a:xfrm>
                       <a:off x="0" y="0"/>
-                      <a:ext cx="4754880" cy="4617618"/>
+                      <a:ext cx="4754880" cy="3341643"/>
                     </a:xfrm>
                     <a:prstGeom prst="rect"/>
                   </pic:spPr>
@@ -352,7 +352,7 @@
         <w:rPr>
           <w:b w:val="0"/>
         </w:rPr>
-        <w:t>Подготовлены четыре синтетических изображения 640 × 400: малоконтрастная сцена, сцена с тенями и крайними уровнями, цветные поверхности и однотонное поле. Исходники находятся в samples; generate_samples.py воспроизводит набор. Геометрические объекты и текстура позволяют сравнить читаемость деталей и изменение цвета.</w:t>
+        <w:t>Подготовлены 10 синтетических изображений 640 × 400. Набор включает удачные случаи повышения контраста, изображения с нежелательными эффектами и случаи без улучшения. Первые четыре примера — малоконтрастная сцена, тени с крайними уровнями, цветные поверхности и однотонное поле. Исходники находятся в samples; generate_samples.py воспроизводит набор. Геометрические объекты и текстура позволяют сравнить читаемость деталей и изменение цвета.</w:t>
       </w:r>
     </w:p>
     <w:p>
@@ -542,6 +542,207 @@
     </w:p>
     <w:p>
       <w:pPr>
+        <w:pStyle w:val="Heading2"/>
+      </w:pPr>
+      <w:r>
+        <w:t>5 1 Удачные случаи и ограничения обработки</w:t>
+      </w:r>
+    </w:p>
+    <w:p>
+      <w:r>
+        <w:rPr>
+          <w:b w:val="0"/>
+        </w:rPr>
+        <w:t>К исходному набору добавлены пейзаж в дымке, бледный документ, слабый сигнал с шумом, шестиступенчатая шкала, пересвеченное небо и равномерная шкала. Оценка «хорошо» или «плохо» относится к конкретному эффекту обработки, а не к правильности алгоритма.</w:t>
+      </w:r>
+    </w:p>
+    <w:p>
+      <w:pPr>
+        <w:keepNext/>
+        <w:jc w:val="center"/>
+      </w:pPr>
+      <w:r>
+        <w:drawing>
+          <wp:inline xmlns:a="http://schemas.openxmlformats.org/drawingml/2006/main" xmlns:pic="http://schemas.openxmlformats.org/drawingml/2006/picture">
+            <wp:extent cx="5715000" cy="1335061"/>
+            <wp:docPr id="5" name="Picture 5"/>
+            <wp:cNvGraphicFramePr>
+              <a:graphicFrameLocks noChangeAspect="1"/>
+            </wp:cNvGraphicFramePr>
+            <a:graphic>
+              <a:graphicData uri="http://schemas.openxmlformats.org/drawingml/2006/picture">
+                <pic:pic>
+                  <pic:nvPicPr>
+                    <pic:cNvPr id="0" name="document-comparison.png"/>
+                    <pic:cNvPicPr/>
+                  </pic:nvPicPr>
+                  <pic:blipFill>
+                    <a:blip r:embed="rId14"/>
+                    <a:stretch>
+                      <a:fillRect/>
+                    </a:stretch>
+                  </pic:blipFill>
+                  <pic:spPr>
+                    <a:xfrm>
+                      <a:off x="0" y="0"/>
+                      <a:ext cx="5715000" cy="1335061"/>
+                    </a:xfrm>
+                    <a:prstGeom prst="rect"/>
+                  </pic:spPr>
+                </pic:pic>
+              </a:graphicData>
+            </a:graphic>
+          </wp:inline>
+        </w:drawing>
+      </w:r>
+    </w:p>
+    <w:p>
+      <w:pPr>
+        <w:jc w:val="center"/>
+      </w:pPr>
+      <w:r>
+        <w:rPr>
+          <w:b w:val="0"/>
+          <w:sz w:val="20"/>
+        </w:rPr>
+        <w:t>Рисунок 5 — Бледный документ: штрихи становятся контрастнее</w:t>
+      </w:r>
+    </w:p>
+    <w:p>
+      <w:r>
+        <w:rPr>
+          <w:b w:val="0"/>
+        </w:rPr>
+        <w:t>На документе диапазон 190–235 растягивается до 0–255, что повышает читаемость штрихов. Эквализация сильнее затемняет фон вне листа. На пейзаже в дымке растяжение диапазона 120–190 помогает различать силуэты, но не восстанавливает отсутствующую текстуру.</w:t>
+      </w:r>
+    </w:p>
+    <w:p>
+      <w:pPr>
+        <w:keepNext/>
+        <w:jc w:val="center"/>
+      </w:pPr>
+      <w:r>
+        <w:drawing>
+          <wp:inline xmlns:a="http://schemas.openxmlformats.org/drawingml/2006/main" xmlns:pic="http://schemas.openxmlformats.org/drawingml/2006/picture">
+            <wp:extent cx="5715000" cy="1335061"/>
+            <wp:docPr id="6" name="Picture 6"/>
+            <wp:cNvGraphicFramePr>
+              <a:graphicFrameLocks noChangeAspect="1"/>
+            </wp:cNvGraphicFramePr>
+            <a:graphic>
+              <a:graphicData uri="http://schemas.openxmlformats.org/drawingml/2006/picture">
+                <pic:pic>
+                  <pic:nvPicPr>
+                    <pic:cNvPr id="0" name="noise-comparison.png"/>
+                    <pic:cNvPicPr/>
+                  </pic:nvPicPr>
+                  <pic:blipFill>
+                    <a:blip r:embed="rId15"/>
+                    <a:stretch>
+                      <a:fillRect/>
+                    </a:stretch>
+                  </pic:blipFill>
+                  <pic:spPr>
+                    <a:xfrm>
+                      <a:off x="0" y="0"/>
+                      <a:ext cx="5715000" cy="1335061"/>
+                    </a:xfrm>
+                    <a:prstGeom prst="rect"/>
+                  </pic:spPr>
+                </pic:pic>
+              </a:graphicData>
+            </a:graphic>
+          </wp:inline>
+        </w:drawing>
+      </w:r>
+    </w:p>
+    <w:p>
+      <w:pPr>
+        <w:jc w:val="center"/>
+      </w:pPr>
+      <w:r>
+        <w:rPr>
+          <w:b w:val="0"/>
+          <w:sz w:val="20"/>
+        </w:rPr>
+        <w:t>Рисунок 6 — Усиление слабого сигнала сопровождается усилением шума</w:t>
+      </w:r>
+    </w:p>
+    <w:p>
+      <w:r>
+        <w:rPr>
+          <w:b w:val="0"/>
+        </w:rPr>
+        <w:t>На зашумлённом поле стандартное отклонение V возрастает с 2,2 до 27,9 после растяжения и до 72,8 после эквализации. Объект заметнее, но изображение становится зернистым. Это разброс по всему изображению, включая объект; его рост не означает повышения качества или удаления шума.</w:t>
+      </w:r>
+    </w:p>
+    <w:p>
+      <w:pPr>
+        <w:keepNext/>
+        <w:jc w:val="center"/>
+      </w:pPr>
+      <w:r>
+        <w:drawing>
+          <wp:inline xmlns:a="http://schemas.openxmlformats.org/drawingml/2006/main" xmlns:pic="http://schemas.openxmlformats.org/drawingml/2006/picture">
+            <wp:extent cx="5715000" cy="1335061"/>
+            <wp:docPr id="7" name="Picture 7"/>
+            <wp:cNvGraphicFramePr>
+              <a:graphicFrameLocks noChangeAspect="1"/>
+            </wp:cNvGraphicFramePr>
+            <a:graphic>
+              <a:graphicData uri="http://schemas.openxmlformats.org/drawingml/2006/picture">
+                <pic:pic>
+                  <pic:nvPicPr>
+                    <pic:cNvPr id="0" name="quantized-comparison.png"/>
+                    <pic:cNvPicPr/>
+                  </pic:nvPicPr>
+                  <pic:blipFill>
+                    <a:blip r:embed="rId16"/>
+                    <a:stretch>
+                      <a:fillRect/>
+                    </a:stretch>
+                  </pic:blipFill>
+                  <pic:spPr>
+                    <a:xfrm>
+                      <a:off x="0" y="0"/>
+                      <a:ext cx="5715000" cy="1335061"/>
+                    </a:xfrm>
+                    <a:prstGeom prst="rect"/>
+                  </pic:spPr>
+                </pic:pic>
+              </a:graphicData>
+            </a:graphic>
+          </wp:inline>
+        </w:drawing>
+      </w:r>
+    </w:p>
+    <w:p>
+      <w:pPr>
+        <w:jc w:val="center"/>
+      </w:pPr>
+      <w:r>
+        <w:rPr>
+          <w:b w:val="0"/>
+          <w:sz w:val="20"/>
+        </w:rPr>
+        <w:t>Рисунок 7 — Шесть исходных уровней после обработки остаются шестью</w:t>
+      </w:r>
+    </w:p>
+    <w:p>
+      <w:r>
+        <w:rPr>
+          <w:b w:val="0"/>
+        </w:rPr>
+        <w:t>На грубой шкале усиливается полосатость: новые полутона не появляются. На пересвеченной сцене белое небо остаётся белым — потерянные детали восстановить нельзя. Равномерная шкала с одинаковой частотой всех 256 уровней, как и однотонное поле, не меняется при выбранных преобразованиях.</w:t>
+      </w:r>
+    </w:p>
+    <w:p>
+      <w:r>
+        <w:br w:type="page"/>
+      </w:r>
+    </w:p>
+    <w:p>
+      <w:pPr>
         <w:pStyle w:val="Heading1"/>
         <w:spacing w:line="252" w:lineRule="auto" w:after="100" w:before="240"/>
       </w:pPr>
@@ -557,7 +758,7 @@
         <w:rPr>
           <w:b w:val="0"/>
         </w:rPr>
-        <w:t>Команда node test.cjs выполнила 15 036 проверок, результат PASS. Проверены известные преобразования, пустой массив, чёрный, белый и однотонный цвет, недопустимые параметры, отсутствие изменения исходного массива, сохранение альфа-канала и пропорций RGB при обработке V на 1000 псевдослучайных пикселях.</w:t>
+        <w:t>Команда node test.cjs: 15 089 проверок, PASS. Проверены формулы, граничные случаи, недопустимые параметры, сохранение исходных данных и альфа-канала. На 1000 случайных пикселях проверены пропорции RGB при обработке V; на 10 примерах — размеры, сохранение шести уровней, белых пикселей пересвета и равномерной шкалы.</w:t>
       </w:r>
     </w:p>
     <w:tbl>
@@ -1361,7 +1562,7 @@
         <w:rPr>
           <w:b w:val="0"/>
         </w:rPr>
-        <w:t>Разработано приложение для варианта 1 с тремя поэлементными операциями, линейным контрастированием и двумя подходами к эквализации цветных изображений. Подготовлены четыре тестовых изображения, автоматические проверки и наглядное сравнение результатов.</w:t>
+        <w:t>Разработано приложение для варианта 1 с тремя поэлементными операциями, линейным контрастированием и двумя подходами к эквализации цветных изображений. Подготовлены 10 тестовых изображений, автоматические проверки и наглядное сравнение результатов.</w:t>
       </w:r>
     </w:p>
     <w:p>

</xml_diff>